<commit_message>
docs: Atualização na linha de referencia do manual das decisões 6.23 e .24 e doc Arquitetura do sistema
</commit_message>
<xml_diff>
--- a/docs/4_manual/Manual_Fase1_v1.0.0.docx
+++ b/docs/4_manual/Manual_Fase1_v1.0.0.docx
@@ -153,12 +153,6 @@
         <w:gridCol w:w="6500"/>
       </w:tblGrid>
       <w:tr>
-        <w:tblPrEx>
-          <w:tblCellMar>
-            <w:top w:w="0" w:type="dxa"/>
-            <w:bottom w:w="0" w:type="dxa"/>
-          </w:tblCellMar>
-        </w:tblPrEx>
         <w:trPr>
           <w:tblHeader/>
         </w:trPr>
@@ -212,12 +206,6 @@
         </w:tc>
       </w:tr>
       <w:tr>
-        <w:tblPrEx>
-          <w:tblCellMar>
-            <w:top w:w="0" w:type="dxa"/>
-            <w:bottom w:w="0" w:type="dxa"/>
-          </w:tblCellMar>
-        </w:tblPrEx>
         <w:tc>
           <w:tcPr>
             <w:tcW w:w="3000" w:type="dxa"/>
@@ -264,12 +252,6 @@
         </w:tc>
       </w:tr>
       <w:tr>
-        <w:tblPrEx>
-          <w:tblCellMar>
-            <w:top w:w="0" w:type="dxa"/>
-            <w:bottom w:w="0" w:type="dxa"/>
-          </w:tblCellMar>
-        </w:tblPrEx>
         <w:tc>
           <w:tcPr>
             <w:tcW w:w="3000" w:type="dxa"/>
@@ -316,12 +298,6 @@
         </w:tc>
       </w:tr>
       <w:tr>
-        <w:tblPrEx>
-          <w:tblCellMar>
-            <w:top w:w="0" w:type="dxa"/>
-            <w:bottom w:w="0" w:type="dxa"/>
-          </w:tblCellMar>
-        </w:tblPrEx>
         <w:tc>
           <w:tcPr>
             <w:tcW w:w="3000" w:type="dxa"/>
@@ -368,12 +344,6 @@
         </w:tc>
       </w:tr>
       <w:tr>
-        <w:tblPrEx>
-          <w:tblCellMar>
-            <w:top w:w="0" w:type="dxa"/>
-            <w:bottom w:w="0" w:type="dxa"/>
-          </w:tblCellMar>
-        </w:tblPrEx>
         <w:tc>
           <w:tcPr>
             <w:tcW w:w="3000" w:type="dxa"/>
@@ -420,12 +390,6 @@
         </w:tc>
       </w:tr>
       <w:tr>
-        <w:tblPrEx>
-          <w:tblCellMar>
-            <w:top w:w="0" w:type="dxa"/>
-            <w:bottom w:w="0" w:type="dxa"/>
-          </w:tblCellMar>
-        </w:tblPrEx>
         <w:tc>
           <w:tcPr>
             <w:tcW w:w="3000" w:type="dxa"/>
@@ -490,12 +454,6 @@
         </w:tc>
       </w:tr>
       <w:tr>
-        <w:tblPrEx>
-          <w:tblCellMar>
-            <w:top w:w="0" w:type="dxa"/>
-            <w:bottom w:w="0" w:type="dxa"/>
-          </w:tblCellMar>
-        </w:tblPrEx>
         <w:tc>
           <w:tcPr>
             <w:tcW w:w="3000" w:type="dxa"/>
@@ -542,12 +500,6 @@
         </w:tc>
       </w:tr>
       <w:tr>
-        <w:tblPrEx>
-          <w:tblCellMar>
-            <w:top w:w="0" w:type="dxa"/>
-            <w:bottom w:w="0" w:type="dxa"/>
-          </w:tblCellMar>
-        </w:tblPrEx>
         <w:tc>
           <w:tcPr>
             <w:tcW w:w="3000" w:type="dxa"/>
@@ -2594,71 +2546,13 @@
     </w:p>
     <w:p>
       <w:pPr>
-        <w:pBdr>
-          <w:left w:val="single" w:sz="12" w:space="8" w:color="1F4E79"/>
-        </w:pBdr>
-        <w:spacing w:before="80" w:after="240"/>
-        <w:ind w:left="200"/>
-      </w:pPr>
-      <w:r>
-        <w:rPr>
-          <w:b/>
-          <w:bCs/>
-          <w:i/>
-          <w:iCs/>
-          <w:sz w:val="20"/>
-          <w:szCs w:val="20"/>
-        </w:rPr>
-        <w:t xml:space="preserve">Nota: </w:t>
-      </w:r>
-      <w:r>
-        <w:rPr>
-          <w:i/>
-          <w:iCs/>
-          <w:sz w:val="20"/>
-          <w:szCs w:val="20"/>
-        </w:rPr>
-        <w:t xml:space="preserve">Os detalhes exatos do comportamento na primeira execução (por exemplo, se a pasta de dados é criada automaticamente quando ainda não existe, e a localização </w:t>
-      </w:r>
-      <w:proofErr w:type="spellStart"/>
-      <w:r>
-        <w:rPr>
-          <w:i/>
-          <w:iCs/>
-          <w:sz w:val="20"/>
-          <w:szCs w:val="20"/>
-        </w:rPr>
-        <w:t>exacta</w:t>
-      </w:r>
-      <w:proofErr w:type="spellEnd"/>
-      <w:r>
-        <w:rPr>
-          <w:i/>
-          <w:iCs/>
-          <w:sz w:val="20"/>
-          <w:szCs w:val="20"/>
-        </w:rPr>
-        <w:t xml:space="preserve"> dessa pasta) devem ser </w:t>
-      </w:r>
-      <w:r>
-        <w:rPr>
-          <w:i/>
-          <w:iCs/>
-          <w:sz w:val="20"/>
-          <w:szCs w:val="20"/>
-        </w:rPr>
-        <w:lastRenderedPageBreak/>
-        <w:t>confirmados diretamente em main.py e repositorio.py antes de esta secção ser considerada final — não foram revistos nesta sessão.</w:t>
-      </w:r>
-    </w:p>
-    <w:p>
-      <w:pPr>
         <w:pStyle w:val="Ttulo1"/>
         <w:spacing w:before="320" w:after="160"/>
       </w:pPr>
       <w:bookmarkStart w:id="12" w:name="sec-utilizacao"/>
       <w:bookmarkStart w:id="13" w:name="_Toc238585191"/>
       <w:r>
+        <w:lastRenderedPageBreak/>
         <w:t>3. Utilização</w:t>
       </w:r>
       <w:bookmarkEnd w:id="12"/>
@@ -2694,12 +2588,6 @@
         <w:gridCol w:w="6300"/>
       </w:tblGrid>
       <w:tr>
-        <w:tblPrEx>
-          <w:tblCellMar>
-            <w:top w:w="0" w:type="dxa"/>
-            <w:bottom w:w="0" w:type="dxa"/>
-          </w:tblCellMar>
-        </w:tblPrEx>
         <w:trPr>
           <w:tblHeader/>
         </w:trPr>
@@ -2753,12 +2641,6 @@
         </w:tc>
       </w:tr>
       <w:tr>
-        <w:tblPrEx>
-          <w:tblCellMar>
-            <w:top w:w="0" w:type="dxa"/>
-            <w:bottom w:w="0" w:type="dxa"/>
-          </w:tblCellMar>
-        </w:tblPrEx>
         <w:tc>
           <w:tcPr>
             <w:tcW w:w="3200" w:type="dxa"/>
@@ -2805,12 +2687,6 @@
         </w:tc>
       </w:tr>
       <w:tr>
-        <w:tblPrEx>
-          <w:tblCellMar>
-            <w:top w:w="0" w:type="dxa"/>
-            <w:bottom w:w="0" w:type="dxa"/>
-          </w:tblCellMar>
-        </w:tblPrEx>
         <w:tc>
           <w:tcPr>
             <w:tcW w:w="3200" w:type="dxa"/>
@@ -2857,12 +2733,6 @@
         </w:tc>
       </w:tr>
       <w:tr>
-        <w:tblPrEx>
-          <w:tblCellMar>
-            <w:top w:w="0" w:type="dxa"/>
-            <w:bottom w:w="0" w:type="dxa"/>
-          </w:tblCellMar>
-        </w:tblPrEx>
         <w:tc>
           <w:tcPr>
             <w:tcW w:w="3200" w:type="dxa"/>
@@ -2909,12 +2779,6 @@
         </w:tc>
       </w:tr>
       <w:tr>
-        <w:tblPrEx>
-          <w:tblCellMar>
-            <w:top w:w="0" w:type="dxa"/>
-            <w:bottom w:w="0" w:type="dxa"/>
-          </w:tblCellMar>
-        </w:tblPrEx>
         <w:tc>
           <w:tcPr>
             <w:tcW w:w="3200" w:type="dxa"/>
@@ -2961,12 +2825,6 @@
         </w:tc>
       </w:tr>
       <w:tr>
-        <w:tblPrEx>
-          <w:tblCellMar>
-            <w:top w:w="0" w:type="dxa"/>
-            <w:bottom w:w="0" w:type="dxa"/>
-          </w:tblCellMar>
-        </w:tblPrEx>
         <w:tc>
           <w:tcPr>
             <w:tcW w:w="3200" w:type="dxa"/>
@@ -3013,12 +2871,6 @@
         </w:tc>
       </w:tr>
       <w:tr>
-        <w:tblPrEx>
-          <w:tblCellMar>
-            <w:top w:w="0" w:type="dxa"/>
-            <w:bottom w:w="0" w:type="dxa"/>
-          </w:tblCellMar>
-        </w:tblPrEx>
         <w:tc>
           <w:tcPr>
             <w:tcW w:w="3200" w:type="dxa"/>
@@ -3108,12 +2960,6 @@
         <w:gridCol w:w="6300"/>
       </w:tblGrid>
       <w:tr>
-        <w:tblPrEx>
-          <w:tblCellMar>
-            <w:top w:w="0" w:type="dxa"/>
-            <w:bottom w:w="0" w:type="dxa"/>
-          </w:tblCellMar>
-        </w:tblPrEx>
         <w:trPr>
           <w:tblHeader/>
         </w:trPr>
@@ -3167,12 +3013,6 @@
         </w:tc>
       </w:tr>
       <w:tr>
-        <w:tblPrEx>
-          <w:tblCellMar>
-            <w:top w:w="0" w:type="dxa"/>
-            <w:bottom w:w="0" w:type="dxa"/>
-          </w:tblCellMar>
-        </w:tblPrEx>
         <w:tc>
           <w:tcPr>
             <w:tcW w:w="3200" w:type="dxa"/>
@@ -3219,12 +3059,6 @@
         </w:tc>
       </w:tr>
       <w:tr>
-        <w:tblPrEx>
-          <w:tblCellMar>
-            <w:top w:w="0" w:type="dxa"/>
-            <w:bottom w:w="0" w:type="dxa"/>
-          </w:tblCellMar>
-        </w:tblPrEx>
         <w:tc>
           <w:tcPr>
             <w:tcW w:w="3200" w:type="dxa"/>
@@ -3271,12 +3105,6 @@
         </w:tc>
       </w:tr>
       <w:tr>
-        <w:tblPrEx>
-          <w:tblCellMar>
-            <w:top w:w="0" w:type="dxa"/>
-            <w:bottom w:w="0" w:type="dxa"/>
-          </w:tblCellMar>
-        </w:tblPrEx>
         <w:tc>
           <w:tcPr>
             <w:tcW w:w="3200" w:type="dxa"/>
@@ -3323,12 +3151,6 @@
         </w:tc>
       </w:tr>
       <w:tr>
-        <w:tblPrEx>
-          <w:tblCellMar>
-            <w:top w:w="0" w:type="dxa"/>
-            <w:bottom w:w="0" w:type="dxa"/>
-          </w:tblCellMar>
-        </w:tblPrEx>
         <w:tc>
           <w:tcPr>
             <w:tcW w:w="3200" w:type="dxa"/>
@@ -3375,12 +3197,6 @@
         </w:tc>
       </w:tr>
       <w:tr>
-        <w:tblPrEx>
-          <w:tblCellMar>
-            <w:top w:w="0" w:type="dxa"/>
-            <w:bottom w:w="0" w:type="dxa"/>
-          </w:tblCellMar>
-        </w:tblPrEx>
         <w:tc>
           <w:tcPr>
             <w:tcW w:w="3200" w:type="dxa"/>
@@ -3470,12 +3286,6 @@
         <w:gridCol w:w="6300"/>
       </w:tblGrid>
       <w:tr>
-        <w:tblPrEx>
-          <w:tblCellMar>
-            <w:top w:w="0" w:type="dxa"/>
-            <w:bottom w:w="0" w:type="dxa"/>
-          </w:tblCellMar>
-        </w:tblPrEx>
         <w:trPr>
           <w:tblHeader/>
         </w:trPr>
@@ -3529,12 +3339,6 @@
         </w:tc>
       </w:tr>
       <w:tr>
-        <w:tblPrEx>
-          <w:tblCellMar>
-            <w:top w:w="0" w:type="dxa"/>
-            <w:bottom w:w="0" w:type="dxa"/>
-          </w:tblCellMar>
-        </w:tblPrEx>
         <w:tc>
           <w:tcPr>
             <w:tcW w:w="3200" w:type="dxa"/>
@@ -3581,12 +3385,6 @@
         </w:tc>
       </w:tr>
       <w:tr>
-        <w:tblPrEx>
-          <w:tblCellMar>
-            <w:top w:w="0" w:type="dxa"/>
-            <w:bottom w:w="0" w:type="dxa"/>
-          </w:tblCellMar>
-        </w:tblPrEx>
         <w:tc>
           <w:tcPr>
             <w:tcW w:w="3200" w:type="dxa"/>
@@ -3633,12 +3431,6 @@
         </w:tc>
       </w:tr>
       <w:tr>
-        <w:tblPrEx>
-          <w:tblCellMar>
-            <w:top w:w="0" w:type="dxa"/>
-            <w:bottom w:w="0" w:type="dxa"/>
-          </w:tblCellMar>
-        </w:tblPrEx>
         <w:tc>
           <w:tcPr>
             <w:tcW w:w="3200" w:type="dxa"/>
@@ -3685,12 +3477,6 @@
         </w:tc>
       </w:tr>
       <w:tr>
-        <w:tblPrEx>
-          <w:tblCellMar>
-            <w:top w:w="0" w:type="dxa"/>
-            <w:bottom w:w="0" w:type="dxa"/>
-          </w:tblCellMar>
-        </w:tblPrEx>
         <w:tc>
           <w:tcPr>
             <w:tcW w:w="3200" w:type="dxa"/>
@@ -3737,12 +3523,6 @@
         </w:tc>
       </w:tr>
       <w:tr>
-        <w:tblPrEx>
-          <w:tblCellMar>
-            <w:top w:w="0" w:type="dxa"/>
-            <w:bottom w:w="0" w:type="dxa"/>
-          </w:tblCellMar>
-        </w:tblPrEx>
         <w:tc>
           <w:tcPr>
             <w:tcW w:w="3200" w:type="dxa"/>
@@ -3789,12 +3569,6 @@
         </w:tc>
       </w:tr>
       <w:tr>
-        <w:tblPrEx>
-          <w:tblCellMar>
-            <w:top w:w="0" w:type="dxa"/>
-            <w:bottom w:w="0" w:type="dxa"/>
-          </w:tblCellMar>
-        </w:tblPrEx>
         <w:tc>
           <w:tcPr>
             <w:tcW w:w="3200" w:type="dxa"/>
@@ -3813,7 +3587,6 @@
                 <w:sz w:val="20"/>
                 <w:szCs w:val="20"/>
               </w:rPr>
-              <w:lastRenderedPageBreak/>
               <w:t>Marcar em manutenção</w:t>
             </w:r>
           </w:p>
@@ -3842,12 +3615,6 @@
         </w:tc>
       </w:tr>
       <w:tr>
-        <w:tblPrEx>
-          <w:tblCellMar>
-            <w:top w:w="0" w:type="dxa"/>
-            <w:bottom w:w="0" w:type="dxa"/>
-          </w:tblCellMar>
-        </w:tblPrEx>
         <w:tc>
           <w:tcPr>
             <w:tcW w:w="3200" w:type="dxa"/>
@@ -3866,6 +3633,7 @@
                 <w:sz w:val="20"/>
                 <w:szCs w:val="20"/>
               </w:rPr>
+              <w:lastRenderedPageBreak/>
               <w:t>Desmarcar manutenção</w:t>
             </w:r>
           </w:p>
@@ -3894,12 +3662,6 @@
         </w:tc>
       </w:tr>
       <w:tr>
-        <w:tblPrEx>
-          <w:tblCellMar>
-            <w:top w:w="0" w:type="dxa"/>
-            <w:bottom w:w="0" w:type="dxa"/>
-          </w:tblCellMar>
-        </w:tblPrEx>
         <w:tc>
           <w:tcPr>
             <w:tcW w:w="3200" w:type="dxa"/>
@@ -3989,12 +3751,6 @@
         <w:gridCol w:w="6300"/>
       </w:tblGrid>
       <w:tr>
-        <w:tblPrEx>
-          <w:tblCellMar>
-            <w:top w:w="0" w:type="dxa"/>
-            <w:bottom w:w="0" w:type="dxa"/>
-          </w:tblCellMar>
-        </w:tblPrEx>
         <w:trPr>
           <w:tblHeader/>
         </w:trPr>
@@ -4048,12 +3804,6 @@
         </w:tc>
       </w:tr>
       <w:tr>
-        <w:tblPrEx>
-          <w:tblCellMar>
-            <w:top w:w="0" w:type="dxa"/>
-            <w:bottom w:w="0" w:type="dxa"/>
-          </w:tblCellMar>
-        </w:tblPrEx>
         <w:tc>
           <w:tcPr>
             <w:tcW w:w="3200" w:type="dxa"/>
@@ -4100,12 +3850,6 @@
         </w:tc>
       </w:tr>
       <w:tr>
-        <w:tblPrEx>
-          <w:tblCellMar>
-            <w:top w:w="0" w:type="dxa"/>
-            <w:bottom w:w="0" w:type="dxa"/>
-          </w:tblCellMar>
-        </w:tblPrEx>
         <w:tc>
           <w:tcPr>
             <w:tcW w:w="3200" w:type="dxa"/>
@@ -4152,12 +3896,6 @@
         </w:tc>
       </w:tr>
       <w:tr>
-        <w:tblPrEx>
-          <w:tblCellMar>
-            <w:top w:w="0" w:type="dxa"/>
-            <w:bottom w:w="0" w:type="dxa"/>
-          </w:tblCellMar>
-        </w:tblPrEx>
         <w:tc>
           <w:tcPr>
             <w:tcW w:w="3200" w:type="dxa"/>
@@ -4204,12 +3942,6 @@
         </w:tc>
       </w:tr>
       <w:tr>
-        <w:tblPrEx>
-          <w:tblCellMar>
-            <w:top w:w="0" w:type="dxa"/>
-            <w:bottom w:w="0" w:type="dxa"/>
-          </w:tblCellMar>
-        </w:tblPrEx>
         <w:tc>
           <w:tcPr>
             <w:tcW w:w="3200" w:type="dxa"/>
@@ -4256,12 +3988,6 @@
         </w:tc>
       </w:tr>
       <w:tr>
-        <w:tblPrEx>
-          <w:tblCellMar>
-            <w:top w:w="0" w:type="dxa"/>
-            <w:bottom w:w="0" w:type="dxa"/>
-          </w:tblCellMar>
-        </w:tblPrEx>
         <w:tc>
           <w:tcPr>
             <w:tcW w:w="3200" w:type="dxa"/>
@@ -4308,12 +4034,6 @@
         </w:tc>
       </w:tr>
       <w:tr>
-        <w:tblPrEx>
-          <w:tblCellMar>
-            <w:top w:w="0" w:type="dxa"/>
-            <w:bottom w:w="0" w:type="dxa"/>
-          </w:tblCellMar>
-        </w:tblPrEx>
         <w:tc>
           <w:tcPr>
             <w:tcW w:w="3200" w:type="dxa"/>
@@ -4419,12 +4139,6 @@
         <w:gridCol w:w="6300"/>
       </w:tblGrid>
       <w:tr>
-        <w:tblPrEx>
-          <w:tblCellMar>
-            <w:top w:w="0" w:type="dxa"/>
-            <w:bottom w:w="0" w:type="dxa"/>
-          </w:tblCellMar>
-        </w:tblPrEx>
         <w:trPr>
           <w:tblHeader/>
         </w:trPr>
@@ -4478,12 +4192,6 @@
         </w:tc>
       </w:tr>
       <w:tr>
-        <w:tblPrEx>
-          <w:tblCellMar>
-            <w:top w:w="0" w:type="dxa"/>
-            <w:bottom w:w="0" w:type="dxa"/>
-          </w:tblCellMar>
-        </w:tblPrEx>
         <w:tc>
           <w:tcPr>
             <w:tcW w:w="3200" w:type="dxa"/>
@@ -4530,12 +4238,6 @@
         </w:tc>
       </w:tr>
       <w:tr>
-        <w:tblPrEx>
-          <w:tblCellMar>
-            <w:top w:w="0" w:type="dxa"/>
-            <w:bottom w:w="0" w:type="dxa"/>
-          </w:tblCellMar>
-        </w:tblPrEx>
         <w:tc>
           <w:tcPr>
             <w:tcW w:w="3200" w:type="dxa"/>
@@ -4582,12 +4284,6 @@
         </w:tc>
       </w:tr>
       <w:tr>
-        <w:tblPrEx>
-          <w:tblCellMar>
-            <w:top w:w="0" w:type="dxa"/>
-            <w:bottom w:w="0" w:type="dxa"/>
-          </w:tblCellMar>
-        </w:tblPrEx>
         <w:tc>
           <w:tcPr>
             <w:tcW w:w="3200" w:type="dxa"/>
@@ -4634,12 +4330,6 @@
         </w:tc>
       </w:tr>
       <w:tr>
-        <w:tblPrEx>
-          <w:tblCellMar>
-            <w:top w:w="0" w:type="dxa"/>
-            <w:bottom w:w="0" w:type="dxa"/>
-          </w:tblCellMar>
-        </w:tblPrEx>
         <w:tc>
           <w:tcPr>
             <w:tcW w:w="3200" w:type="dxa"/>
@@ -4686,12 +4376,6 @@
         </w:tc>
       </w:tr>
       <w:tr>
-        <w:tblPrEx>
-          <w:tblCellMar>
-            <w:top w:w="0" w:type="dxa"/>
-            <w:bottom w:w="0" w:type="dxa"/>
-          </w:tblCellMar>
-        </w:tblPrEx>
         <w:tc>
           <w:tcPr>
             <w:tcW w:w="3200" w:type="dxa"/>
@@ -4781,12 +4465,6 @@
         <w:gridCol w:w="6300"/>
       </w:tblGrid>
       <w:tr>
-        <w:tblPrEx>
-          <w:tblCellMar>
-            <w:top w:w="0" w:type="dxa"/>
-            <w:bottom w:w="0" w:type="dxa"/>
-          </w:tblCellMar>
-        </w:tblPrEx>
         <w:trPr>
           <w:tblHeader/>
         </w:trPr>
@@ -4810,7 +4488,6 @@
                 <w:sz w:val="20"/>
                 <w:szCs w:val="20"/>
               </w:rPr>
-              <w:lastRenderedPageBreak/>
               <w:t>Opção</w:t>
             </w:r>
           </w:p>
@@ -4841,12 +4518,6 @@
         </w:tc>
       </w:tr>
       <w:tr>
-        <w:tblPrEx>
-          <w:tblCellMar>
-            <w:top w:w="0" w:type="dxa"/>
-            <w:bottom w:w="0" w:type="dxa"/>
-          </w:tblCellMar>
-        </w:tblPrEx>
         <w:tc>
           <w:tcPr>
             <w:tcW w:w="3200" w:type="dxa"/>
@@ -4893,12 +4564,6 @@
         </w:tc>
       </w:tr>
       <w:tr>
-        <w:tblPrEx>
-          <w:tblCellMar>
-            <w:top w:w="0" w:type="dxa"/>
-            <w:bottom w:w="0" w:type="dxa"/>
-          </w:tblCellMar>
-        </w:tblPrEx>
         <w:tc>
           <w:tcPr>
             <w:tcW w:w="3200" w:type="dxa"/>
@@ -4917,6 +4582,7 @@
                 <w:sz w:val="20"/>
                 <w:szCs w:val="20"/>
               </w:rPr>
+              <w:lastRenderedPageBreak/>
               <w:t>Registar reserva Airbnb</w:t>
             </w:r>
           </w:p>
@@ -4945,12 +4611,6 @@
         </w:tc>
       </w:tr>
       <w:tr>
-        <w:tblPrEx>
-          <w:tblCellMar>
-            <w:top w:w="0" w:type="dxa"/>
-            <w:bottom w:w="0" w:type="dxa"/>
-          </w:tblCellMar>
-        </w:tblPrEx>
         <w:tc>
           <w:tcPr>
             <w:tcW w:w="3200" w:type="dxa"/>
@@ -4997,12 +4657,6 @@
         </w:tc>
       </w:tr>
       <w:tr>
-        <w:tblPrEx>
-          <w:tblCellMar>
-            <w:top w:w="0" w:type="dxa"/>
-            <w:bottom w:w="0" w:type="dxa"/>
-          </w:tblCellMar>
-        </w:tblPrEx>
         <w:tc>
           <w:tcPr>
             <w:tcW w:w="3200" w:type="dxa"/>
@@ -5049,12 +4703,6 @@
         </w:tc>
       </w:tr>
       <w:tr>
-        <w:tblPrEx>
-          <w:tblCellMar>
-            <w:top w:w="0" w:type="dxa"/>
-            <w:bottom w:w="0" w:type="dxa"/>
-          </w:tblCellMar>
-        </w:tblPrEx>
         <w:tc>
           <w:tcPr>
             <w:tcW w:w="3200" w:type="dxa"/>
@@ -5101,12 +4749,6 @@
         </w:tc>
       </w:tr>
       <w:tr>
-        <w:tblPrEx>
-          <w:tblCellMar>
-            <w:top w:w="0" w:type="dxa"/>
-            <w:bottom w:w="0" w:type="dxa"/>
-          </w:tblCellMar>
-        </w:tblPrEx>
         <w:tc>
           <w:tcPr>
             <w:tcW w:w="3200" w:type="dxa"/>
@@ -5153,12 +4795,6 @@
         </w:tc>
       </w:tr>
       <w:tr>
-        <w:tblPrEx>
-          <w:tblCellMar>
-            <w:top w:w="0" w:type="dxa"/>
-            <w:bottom w:w="0" w:type="dxa"/>
-          </w:tblCellMar>
-        </w:tblPrEx>
         <w:tc>
           <w:tcPr>
             <w:tcW w:w="3200" w:type="dxa"/>
@@ -5205,12 +4841,6 @@
         </w:tc>
       </w:tr>
       <w:tr>
-        <w:tblPrEx>
-          <w:tblCellMar>
-            <w:top w:w="0" w:type="dxa"/>
-            <w:bottom w:w="0" w:type="dxa"/>
-          </w:tblCellMar>
-        </w:tblPrEx>
         <w:tc>
           <w:tcPr>
             <w:tcW w:w="3200" w:type="dxa"/>
@@ -5300,12 +4930,6 @@
         <w:gridCol w:w="6300"/>
       </w:tblGrid>
       <w:tr>
-        <w:tblPrEx>
-          <w:tblCellMar>
-            <w:top w:w="0" w:type="dxa"/>
-            <w:bottom w:w="0" w:type="dxa"/>
-          </w:tblCellMar>
-        </w:tblPrEx>
         <w:trPr>
           <w:tblHeader/>
         </w:trPr>
@@ -5359,12 +4983,6 @@
         </w:tc>
       </w:tr>
       <w:tr>
-        <w:tblPrEx>
-          <w:tblCellMar>
-            <w:top w:w="0" w:type="dxa"/>
-            <w:bottom w:w="0" w:type="dxa"/>
-          </w:tblCellMar>
-        </w:tblPrEx>
         <w:tc>
           <w:tcPr>
             <w:tcW w:w="3200" w:type="dxa"/>
@@ -5411,12 +5029,6 @@
         </w:tc>
       </w:tr>
       <w:tr>
-        <w:tblPrEx>
-          <w:tblCellMar>
-            <w:top w:w="0" w:type="dxa"/>
-            <w:bottom w:w="0" w:type="dxa"/>
-          </w:tblCellMar>
-        </w:tblPrEx>
         <w:tc>
           <w:tcPr>
             <w:tcW w:w="3200" w:type="dxa"/>
@@ -5463,12 +5075,6 @@
         </w:tc>
       </w:tr>
       <w:tr>
-        <w:tblPrEx>
-          <w:tblCellMar>
-            <w:top w:w="0" w:type="dxa"/>
-            <w:bottom w:w="0" w:type="dxa"/>
-          </w:tblCellMar>
-        </w:tblPrEx>
         <w:tc>
           <w:tcPr>
             <w:tcW w:w="3200" w:type="dxa"/>
@@ -5575,11 +5181,7 @@
         <w:spacing w:after="160"/>
       </w:pPr>
       <w:r>
-        <w:t xml:space="preserve">A decisão de arquitetura sobre a preservação do histórico de contratos (necessária para a integridade dos relatórios financeiros) entra em conflito direto com o direito ao apagamento do RGPD, caso a única alternativa à eliminação fosse a simples desativação — que mantém os dados identificativos intactos. A solução adotada é a anonimização: o registo do cliente é conservado para efeitos históricos e contabilísticos, mas os campos identificativos (nome, email, telefone, morada, NIF, documento e validade, data de nascimento, contacto de emergência) são substituídos por valores vazios ou por um identificador anónimo. A nacionalidade é a única exceção conservada, por </w:t>
-      </w:r>
-      <w:r>
-        <w:lastRenderedPageBreak/>
-        <w:t>não permitir identificação individual e ter valor estatístico. A operação é irreversível e fica registada com a data de execução e o responsável, para demonstrar o cumprimento do pedido.</w:t>
+        <w:t>A decisão de arquitetura sobre a preservação do histórico de contratos (necessária para a integridade dos relatórios financeiros) entra em conflito direto com o direito ao apagamento do RGPD, caso a única alternativa à eliminação fosse a simples desativação — que mantém os dados identificativos intactos. A solução adotada é a anonimização: o registo do cliente é conservado para efeitos históricos e contabilísticos, mas os campos identificativos (nome, email, telefone, morada, NIF, documento e validade, data de nascimento, contacto de emergência) são substituídos por valores vazios ou por um identificador anónimo. A nacionalidade é a única exceção conservada, por não permitir identificação individual e ter valor estatístico. A operação é irreversível e fica registada com a data de execução e o responsável, para demonstrar o cumprimento do pedido.</w:t>
       </w:r>
     </w:p>
     <w:p>
@@ -5590,6 +5192,7 @@
       <w:bookmarkStart w:id="32" w:name="sec-prazos"/>
       <w:bookmarkStart w:id="33" w:name="_Toc238585201"/>
       <w:r>
+        <w:lastRenderedPageBreak/>
         <w:t>4.1.2 Prazos de conservação</w:t>
       </w:r>
       <w:bookmarkEnd w:id="32"/>
@@ -5626,12 +5229,6 @@
         <w:gridCol w:w="4700"/>
       </w:tblGrid>
       <w:tr>
-        <w:tblPrEx>
-          <w:tblCellMar>
-            <w:top w:w="0" w:type="dxa"/>
-            <w:bottom w:w="0" w:type="dxa"/>
-          </w:tblCellMar>
-        </w:tblPrEx>
         <w:trPr>
           <w:tblHeader/>
         </w:trPr>
@@ -5709,12 +5306,6 @@
         </w:tc>
       </w:tr>
       <w:tr>
-        <w:tblPrEx>
-          <w:tblCellMar>
-            <w:top w:w="0" w:type="dxa"/>
-            <w:bottom w:w="0" w:type="dxa"/>
-          </w:tblCellMar>
-        </w:tblPrEx>
         <w:tc>
           <w:tcPr>
             <w:tcW w:w="3200" w:type="dxa"/>
@@ -5783,12 +5374,6 @@
         </w:tc>
       </w:tr>
       <w:tr>
-        <w:tblPrEx>
-          <w:tblCellMar>
-            <w:top w:w="0" w:type="dxa"/>
-            <w:bottom w:w="0" w:type="dxa"/>
-          </w:tblCellMar>
-        </w:tblPrEx>
         <w:tc>
           <w:tcPr>
             <w:tcW w:w="3200" w:type="dxa"/>
@@ -5857,12 +5442,6 @@
         </w:tc>
       </w:tr>
       <w:tr>
-        <w:tblPrEx>
-          <w:tblCellMar>
-            <w:top w:w="0" w:type="dxa"/>
-            <w:bottom w:w="0" w:type="dxa"/>
-          </w:tblCellMar>
-        </w:tblPrEx>
         <w:tc>
           <w:tcPr>
             <w:tcW w:w="3200" w:type="dxa"/>
@@ -6103,7 +5682,6 @@
       <w:bookmarkStart w:id="38" w:name="sec-referencias"/>
       <w:bookmarkStart w:id="39" w:name="_Toc238585204"/>
       <w:r>
-        <w:lastRenderedPageBreak/>
         <w:t>5. Referências</w:t>
       </w:r>
       <w:bookmarkEnd w:id="38"/>
@@ -6119,7 +5697,34 @@
         <w:spacing w:after="60"/>
       </w:pPr>
       <w:r>
-        <w:t>Arquitetura_Sistema_v1.10.docx — secções 4, 5.4, 6.17, 6.19, 6.22.</w:t>
+        <w:t>Arquitetura_Sistema_v1.1</w:t>
+      </w:r>
+      <w:r>
+        <w:t>1</w:t>
+      </w:r>
+      <w:r>
+        <w:t>.docx — secções 4, 5.4, 6.17, 6.19, 6.22</w:t>
+      </w:r>
+      <w:r>
+        <w:t>,</w:t>
+      </w:r>
+      <w:r>
+        <w:t xml:space="preserve"> </w:t>
+      </w:r>
+      <w:r>
+        <w:t>6.2</w:t>
+      </w:r>
+      <w:r>
+        <w:t xml:space="preserve">3, </w:t>
+      </w:r>
+      <w:r>
+        <w:t>6.2</w:t>
+      </w:r>
+      <w:r>
+        <w:t>4</w:t>
+      </w:r>
+      <w:r>
+        <w:t>.</w:t>
       </w:r>
     </w:p>
     <w:p>
@@ -6132,6 +5737,7 @@
         <w:spacing w:after="60"/>
       </w:pPr>
       <w:r>
+        <w:lastRenderedPageBreak/>
         <w:t>Código-fonte do projeto, etiqueta v1.0.0 (</w:t>
       </w:r>
       <w:proofErr w:type="spellStart"/>

</xml_diff>